<commit_message>
Update the sales agreement and the Instagram account
- Distance sales agreement (TR/EN page and Word downloads): pereme.com.tr is
  listed among the sales websites and the Bodrum branch is removed.
- Instagram now points to @denturpereme; the footer link is larger, shows
  the account name, appears on every page and sits clear of the floating
  support buttons.

Co-Authored-By: Claude Opus 5.5 <noreply@anthropic.com>
</commit_message>
<xml_diff>
--- a/src/content/contracts/mesafeli-satis-sozlesmesi-en.docx
+++ b/src/content/contracts/mesafeli-satis-sozlesmesi-en.docx
@@ -837,176 +837,7 @@
           <w:szCs w:val="24"/>
         </w:rPr>
       </w:pPr>
-      <w:r>
-        <w:rPr>
-          <w:rFonts w:ascii="Book Antiqua" w:hAnsi="Book Antiqua"/>
-          <w:sz w:val="24"/>
-          <w:szCs w:val="24"/>
-        </w:rPr>
-        <w:t>Dentur Avrasya Deniz Taşımacılığı ve Turizm A.Ş. Bodrum Branch</w:t>
-      </w:r>
-    </w:p>
-    <w:p>
-      <w:pPr>
-        <w:spacing w:after="0" w:line="276" w:lineRule="auto"/>
-        <w:jc w:val="both"/>
-        <w:rPr>
-          <w:rFonts w:ascii="Book Antiqua" w:hAnsi="Book Antiqua"/>
-          <w:sz w:val="24"/>
-          <w:szCs w:val="24"/>
-        </w:rPr>
-      </w:pPr>
-    </w:p>
-    <w:tbl>
-      <w:tblPr>
-        <w:tblStyle w:val="TabloKlavuzu"/>
-        <w:tblW w:w="0" w:type="auto"/>
-        <w:tblLook w:val="04A0" w:firstRow="1" w:lastRow="0" w:firstColumn="1" w:lastColumn="0" w:noHBand="0" w:noVBand="1"/>
-      </w:tblPr>
-      <w:tblGrid>
-        <w:gridCol w:w="1980"/>
-        <w:gridCol w:w="7082"/>
-      </w:tblGrid>
-      <w:tr>
-        <w:tc>
-          <w:tcPr>
-            <w:tcW w:w="1980" w:type="dxa"/>
-          </w:tcPr>
-          <w:p>
-            <w:pPr>
-              <w:spacing w:line="276" w:lineRule="auto"/>
-              <w:jc w:val="both"/>
-              <w:rPr>
-                <w:rFonts w:ascii="Book Antiqua" w:hAnsi="Book Antiqua"/>
-                <w:sz w:val="24"/>
-                <w:szCs w:val="24"/>
-              </w:rPr>
-            </w:pPr>
-            <w:r>
-              <w:rPr>
-                <w:rFonts w:ascii="Book Antiqua" w:hAnsi="Book Antiqua"/>
-                <w:sz w:val="24"/>
-                <w:szCs w:val="24"/>
-              </w:rPr>
-              <w:lastRenderedPageBreak/>
-              <w:t>Address</w:t>
-            </w:r>
-          </w:p>
-        </w:tc>
-        <w:tc>
-          <w:tcPr>
-            <w:tcW w:w="7082" w:type="dxa"/>
-          </w:tcPr>
-          <w:p>
-            <w:pPr>
-              <w:spacing w:line="276" w:lineRule="auto"/>
-              <w:jc w:val="both"/>
-              <w:rPr>
-                <w:rFonts w:ascii="Book Antiqua" w:hAnsi="Book Antiqua"/>
-                <w:sz w:val="24"/>
-                <w:szCs w:val="24"/>
-              </w:rPr>
-            </w:pPr>
-            <w:r>
-              <w:rPr>
-                <w:rFonts w:ascii="Book Antiqua" w:hAnsi="Book Antiqua"/>
-                <w:sz w:val="24"/>
-                <w:szCs w:val="24"/>
-              </w:rPr>
-              <w:t>Çarşı Mahallesi Kale Caddesi No:30 Bodrum/Muğla</w:t>
-            </w:r>
-          </w:p>
-          <w:p>
-            <w:pPr>
-              <w:spacing w:line="276" w:lineRule="auto"/>
-              <w:jc w:val="both"/>
-              <w:rPr>
-                <w:rFonts w:ascii="Book Antiqua" w:hAnsi="Book Antiqua"/>
-                <w:sz w:val="24"/>
-                <w:szCs w:val="24"/>
-              </w:rPr>
-            </w:pPr>
-            <w:r>
-              <w:rPr>
-                <w:rFonts w:ascii="Book Antiqua" w:hAnsi="Book Antiqua"/>
-                <w:sz w:val="24"/>
-                <w:szCs w:val="24"/>
-              </w:rPr>
-              <w:t xml:space="preserve"> (Dentur Avrasya Ofisi)</w:t>
-            </w:r>
-          </w:p>
-          <w:p>
-            <w:pPr>
-              <w:spacing w:line="276" w:lineRule="auto"/>
-              <w:jc w:val="both"/>
-              <w:rPr>
-                <w:rFonts w:ascii="Book Antiqua" w:hAnsi="Book Antiqua"/>
-                <w:sz w:val="24"/>
-                <w:szCs w:val="24"/>
-              </w:rPr>
-            </w:pPr>
-          </w:p>
-        </w:tc>
-      </w:tr>
-      <w:tr>
-        <w:tc>
-          <w:tcPr>
-            <w:tcW w:w="1980" w:type="dxa"/>
-          </w:tcPr>
-          <w:p>
-            <w:pPr>
-              <w:spacing w:line="276" w:lineRule="auto"/>
-              <w:jc w:val="both"/>
-              <w:rPr>
-                <w:rFonts w:ascii="Book Antiqua" w:hAnsi="Book Antiqua"/>
-                <w:sz w:val="24"/>
-                <w:szCs w:val="24"/>
-              </w:rPr>
-            </w:pPr>
-            <w:r>
-              <w:rPr>
-                <w:rFonts w:ascii="Book Antiqua" w:hAnsi="Book Antiqua"/>
-                <w:sz w:val="24"/>
-                <w:szCs w:val="24"/>
-              </w:rPr>
-              <w:t>Telephone Number</w:t>
-            </w:r>
-            <w:r>
-              <w:rPr>
-                <w:rFonts w:ascii="Book Antiqua" w:hAnsi="Book Antiqua"/>
-                <w:sz w:val="24"/>
-                <w:szCs w:val="24"/>
-              </w:rPr>
-              <w:tab/>
-            </w:r>
-          </w:p>
-        </w:tc>
-        <w:tc>
-          <w:tcPr>
-            <w:tcW w:w="7082" w:type="dxa"/>
-          </w:tcPr>
-          <w:p>
-            <w:pPr>
-              <w:spacing w:line="276" w:lineRule="auto"/>
-              <w:jc w:val="both"/>
-              <w:rPr>
-                <w:rFonts w:ascii="Book Antiqua" w:hAnsi="Book Antiqua"/>
-                <w:sz w:val="24"/>
-                <w:szCs w:val="24"/>
-              </w:rPr>
-            </w:pPr>
-            <w:r>
-              <w:rPr>
-                <w:rFonts w:ascii="Book Antiqua" w:hAnsi="Book Antiqua"/>
-                <w:sz w:val="24"/>
-                <w:szCs w:val="24"/>
-              </w:rPr>
-              <w:t>0534 896 21 21</w:t>
-            </w:r>
-          </w:p>
-        </w:tc>
-      </w:tr>
-    </w:tbl>
+    </w:p>
     <w:p>
       <w:pPr>
         <w:shd w:val="clear" w:color="auto" w:fill="FFFFFF"/>
@@ -1145,7 +976,7 @@
             <w:szCs w:val="24"/>
             <w:u w:val="none"/>
           </w:rPr>
-          <w:t>www.denturonline.com</w:t>
+          <w:t>pereme.com.tr, www.denturonline.com</w:t>
         </w:r>
       </w:hyperlink>
       <w:r>
@@ -1461,7 +1292,7 @@
             <w:szCs w:val="24"/>
             <w:u w:val="none"/>
           </w:rPr>
-          <w:t>www.denturonline.com</w:t>
+          <w:t>pereme.com.tr, www.denturonline.com</w:t>
         </w:r>
       </w:hyperlink>
       <w:r>
@@ -1610,7 +1441,7 @@
             <w:szCs w:val="24"/>
             <w:u w:val="none"/>
           </w:rPr>
-          <w:t>www.denturonline.com</w:t>
+          <w:t>pereme.com.tr, www.denturonline.com</w:t>
         </w:r>
       </w:hyperlink>
       <w:r>
@@ -1737,7 +1568,7 @@
           <w:sz w:val="24"/>
           <w:szCs w:val="24"/>
         </w:rPr>
-        <w:t xml:space="preserve"> The subject matter of this Agreement is to determine the terms and conditions governing the Seller's sale of passenger transportation tickets to the Buyer by electronic means through the website </w:t>
+        <w:t xml:space="preserve"> The subject matter of this Agreement is to determine the terms and conditions governing the Seller's sale of passenger transportation tickets to the Buyer by electronic means through the websites </w:t>
       </w:r>
       <w:hyperlink r:id="rId16" w:history="1">
         <w:r>
@@ -1749,7 +1580,7 @@
             <w:szCs w:val="24"/>
             <w:u w:val="none"/>
           </w:rPr>
-          <w:t>www.denturonline.com</w:t>
+          <w:t>pereme.com.tr and www.denturonline.com</w:t>
         </w:r>
       </w:hyperlink>
       <w:r>

</xml_diff>